<commit_message>
Informe y boletín 6 terminados
Co-Authored-By: Antoniogp217 <115565834+Antoniogp217@users.noreply.github.com>
Co-Authored-By: Miguel Marin  <158769776+MigueAngel21@users.noreply.github.com>
</commit_message>
<xml_diff>
--- a/Informe.docx
+++ b/Informe.docx
@@ -219,6 +219,12 @@
         </w:rPr>
         <w:t>Antonio García Paredes</w:t>
       </w:r>
+      <w:r>
+        <w:rPr>
+          <w:sz w:val="40"/>
+        </w:rPr>
+        <w:t xml:space="preserve"> 1.3</w:t>
+      </w:r>
     </w:p>
     <w:p>
       <w:pPr>
@@ -374,7 +380,13 @@
         <w:rPr>
           <w:sz w:val="24"/>
         </w:rPr>
-        <w:t>………………………………………………………………</w:t>
+        <w:t>……………………………………………………………………</w:t>
+      </w:r>
+      <w:r>
+        <w:rPr>
+          <w:sz w:val="24"/>
+        </w:rPr>
+        <w:t>…………</w:t>
       </w:r>
       <w:proofErr w:type="gramStart"/>
       <w:r>
@@ -388,7 +400,7 @@
         <w:rPr>
           <w:sz w:val="24"/>
         </w:rPr>
-        <w:t>.</w:t>
+        <w:t>pag2</w:t>
       </w:r>
     </w:p>
     <w:p>
@@ -432,6 +444,12 @@
         <w:t>directorio..</w:t>
       </w:r>
       <w:proofErr w:type="gramEnd"/>
+      <w:r>
+        <w:rPr>
+          <w:sz w:val="24"/>
+        </w:rPr>
+        <w:t>pag2</w:t>
+      </w:r>
     </w:p>
     <w:p>
       <w:pPr>
@@ -464,6 +482,26 @@
         </w:rPr>
         <w:t>…</w:t>
       </w:r>
+      <w:r>
+        <w:rPr>
+          <w:sz w:val="24"/>
+        </w:rPr>
+        <w:t>…</w:t>
+      </w:r>
+      <w:proofErr w:type="gramStart"/>
+      <w:r>
+        <w:rPr>
+          <w:sz w:val="24"/>
+        </w:rPr>
+        <w:t>…….</w:t>
+      </w:r>
+      <w:proofErr w:type="gramEnd"/>
+      <w:r>
+        <w:rPr>
+          <w:sz w:val="24"/>
+        </w:rPr>
+        <w:t>pag7</w:t>
+      </w:r>
     </w:p>
     <w:p>
       <w:pPr>
@@ -494,7 +532,13 @@
         <w:rPr>
           <w:sz w:val="24"/>
         </w:rPr>
-        <w:t>………………………………………………………………</w:t>
+        <w:t>……………………………………………………………………</w:t>
+      </w:r>
+      <w:r>
+        <w:rPr>
+          <w:sz w:val="24"/>
+        </w:rPr>
+        <w:t>…</w:t>
       </w:r>
       <w:proofErr w:type="gramStart"/>
       <w:r>
@@ -508,7 +552,7 @@
         <w:rPr>
           <w:sz w:val="24"/>
         </w:rPr>
-        <w:t>.</w:t>
+        <w:t>.pag9</w:t>
       </w:r>
     </w:p>
     <w:p>
@@ -540,7 +584,21 @@
         <w:rPr>
           <w:sz w:val="24"/>
         </w:rPr>
-        <w:t>………………………………………………….</w:t>
+        <w:t>…………………………………………………</w:t>
+      </w:r>
+      <w:proofErr w:type="gramStart"/>
+      <w:r>
+        <w:rPr>
+          <w:sz w:val="24"/>
+        </w:rPr>
+        <w:t>…….</w:t>
+      </w:r>
+      <w:proofErr w:type="gramEnd"/>
+      <w:r>
+        <w:rPr>
+          <w:sz w:val="24"/>
+        </w:rPr>
+        <w:t>pag12</w:t>
       </w:r>
     </w:p>
     <w:p>
@@ -976,8 +1034,134 @@
         <w:rPr>
           <w:sz w:val="24"/>
         </w:rPr>
+        <w:t>loginOk</w:t>
+      </w:r>
+      <w:proofErr w:type="spellEnd"/>
+    </w:p>
+    <w:p>
+      <w:pPr>
+        <w:rPr>
+          <w:sz w:val="24"/>
+        </w:rPr>
+      </w:pPr>
+      <w:r>
+        <w:rPr>
+          <w:sz w:val="24"/>
+        </w:rPr>
+        <w:t xml:space="preserve">Sentido de la comunicación: Directorio </w:t>
+      </w:r>
+      <w:r>
+        <w:rPr>
+          <w:sz w:val="24"/>
+        </w:rPr>
+        <w:t>→</w:t>
+      </w:r>
+      <w:r>
+        <w:rPr>
+          <w:sz w:val="24"/>
+        </w:rPr>
+        <w:t xml:space="preserve"> Cliente</w:t>
+      </w:r>
+    </w:p>
+    <w:p>
+      <w:pPr>
+        <w:rPr>
+          <w:sz w:val="24"/>
+        </w:rPr>
+      </w:pPr>
+      <w:r>
+        <w:rPr>
+          <w:sz w:val="24"/>
+        </w:rPr>
+        <w:t xml:space="preserve">Descripción: </w:t>
+      </w:r>
+      <w:r>
+        <w:rPr>
+          <w:sz w:val="24"/>
+        </w:rPr>
+        <w:t xml:space="preserve">Este mensaje lo envía el </w:t>
+      </w:r>
+      <w:r>
+        <w:rPr>
+          <w:sz w:val="24"/>
+        </w:rPr>
+        <w:t>Directorio</w:t>
+      </w:r>
+      <w:r>
+        <w:rPr>
+          <w:sz w:val="24"/>
+        </w:rPr>
+        <w:t xml:space="preserve"> al</w:t>
+      </w:r>
+      <w:r>
+        <w:rPr>
+          <w:sz w:val="24"/>
+        </w:rPr>
+        <w:t xml:space="preserve"> Cliente en respuesta a la solicitud de </w:t>
+      </w:r>
+      <w:proofErr w:type="spellStart"/>
+      <w:r>
+        <w:rPr>
+          <w:sz w:val="24"/>
+        </w:rPr>
         <w:t>login</w:t>
       </w:r>
+      <w:proofErr w:type="spellEnd"/>
+      <w:r>
+        <w:rPr>
+          <w:sz w:val="24"/>
+        </w:rPr>
+        <w:t xml:space="preserve"> tras haber comprobado que el </w:t>
+      </w:r>
+      <w:proofErr w:type="spellStart"/>
+      <w:r>
+        <w:rPr>
+          <w:sz w:val="24"/>
+        </w:rPr>
+        <w:t>nickname</w:t>
+      </w:r>
+      <w:proofErr w:type="spellEnd"/>
+      <w:r>
+        <w:rPr>
+          <w:sz w:val="24"/>
+        </w:rPr>
+        <w:t xml:space="preserve"> del usuario no estaba registrado con anterioridad</w:t>
+      </w:r>
+      <w:r>
+        <w:rPr>
+          <w:sz w:val="24"/>
+        </w:rPr>
+        <w:t>.</w:t>
+      </w:r>
+    </w:p>
+    <w:p>
+      <w:pPr>
+        <w:rPr>
+          <w:sz w:val="24"/>
+        </w:rPr>
+      </w:pPr>
+      <w:r>
+        <w:rPr>
+          <w:sz w:val="24"/>
+        </w:rPr>
+        <w:t>Ejemplo:</w:t>
+      </w:r>
+    </w:p>
+    <w:p>
+      <w:pPr>
+        <w:spacing w:after="0"/>
+        <w:rPr>
+          <w:sz w:val="24"/>
+        </w:rPr>
+      </w:pPr>
+      <w:proofErr w:type="spellStart"/>
+      <w:proofErr w:type="gramStart"/>
+      <w:r>
+        <w:rPr>
+          <w:sz w:val="24"/>
+        </w:rPr>
+        <w:t>operation:login</w:t>
+      </w:r>
       <w:r>
         <w:rPr>
           <w:sz w:val="24"/>
@@ -985,132 +1169,12 @@
         <w:t>Ok</w:t>
       </w:r>
       <w:proofErr w:type="spellEnd"/>
-    </w:p>
-    <w:p>
-      <w:pPr>
-        <w:rPr>
-          <w:sz w:val="24"/>
-        </w:rPr>
-      </w:pPr>
-      <w:r>
-        <w:rPr>
-          <w:sz w:val="24"/>
-        </w:rPr>
-        <w:t xml:space="preserve">Sentido de la comunicación: </w:t>
-      </w:r>
-      <w:r>
-        <w:rPr>
-          <w:sz w:val="24"/>
-        </w:rPr>
-        <w:t>Directorio</w:t>
-      </w:r>
-      <w:r>
-        <w:rPr>
-          <w:sz w:val="24"/>
-        </w:rPr>
-        <w:t xml:space="preserve"> </w:t>
-      </w:r>
-      <w:r>
-        <w:rPr>
-          <w:sz w:val="24"/>
-        </w:rPr>
-        <w:t>→</w:t>
-      </w:r>
-      <w:r>
-        <w:rPr>
-          <w:sz w:val="24"/>
-        </w:rPr>
-        <w:t xml:space="preserve"> </w:t>
-      </w:r>
-      <w:r>
-        <w:rPr>
-          <w:sz w:val="24"/>
-        </w:rPr>
-        <w:t>Cliente</w:t>
-      </w:r>
-    </w:p>
-    <w:p>
-      <w:pPr>
-        <w:rPr>
-          <w:sz w:val="24"/>
-        </w:rPr>
-      </w:pPr>
-      <w:r>
-        <w:rPr>
-          <w:sz w:val="24"/>
-        </w:rPr>
-        <w:t xml:space="preserve">Descripción: </w:t>
-      </w:r>
-      <w:r>
-        <w:rPr>
-          <w:sz w:val="24"/>
-        </w:rPr>
-        <w:t xml:space="preserve">Este mensaje lo envía el </w:t>
-      </w:r>
-      <w:r>
-        <w:rPr>
-          <w:sz w:val="24"/>
-        </w:rPr>
-        <w:t>Directorio</w:t>
-      </w:r>
-      <w:r>
-        <w:rPr>
-          <w:sz w:val="24"/>
-        </w:rPr>
-        <w:t xml:space="preserve"> al</w:t>
-      </w:r>
-      <w:r>
-        <w:rPr>
-          <w:sz w:val="24"/>
-        </w:rPr>
-        <w:t xml:space="preserve"> Cliente en respuesta a la solicitud de </w:t>
-      </w:r>
-      <w:proofErr w:type="spellStart"/>
-      <w:r>
-        <w:rPr>
-          <w:sz w:val="24"/>
-        </w:rPr>
-        <w:t>login</w:t>
-      </w:r>
-      <w:proofErr w:type="spellEnd"/>
-      <w:r>
-        <w:rPr>
-          <w:sz w:val="24"/>
-        </w:rPr>
-        <w:t xml:space="preserve"> tras haber comprobado que el </w:t>
-      </w:r>
-      <w:proofErr w:type="spellStart"/>
-      <w:r>
-        <w:rPr>
-          <w:sz w:val="24"/>
-        </w:rPr>
-        <w:t>nickname</w:t>
-      </w:r>
-      <w:proofErr w:type="spellEnd"/>
-      <w:r>
-        <w:rPr>
-          <w:sz w:val="24"/>
-        </w:rPr>
-        <w:t xml:space="preserve"> del usuario no estaba registrado con anterioridad</w:t>
-      </w:r>
-      <w:r>
-        <w:rPr>
-          <w:sz w:val="24"/>
-        </w:rPr>
-        <w:t>.</w:t>
-      </w:r>
-    </w:p>
-    <w:p>
-      <w:pPr>
-        <w:rPr>
-          <w:sz w:val="24"/>
-        </w:rPr>
-      </w:pPr>
-      <w:r>
-        <w:rPr>
-          <w:sz w:val="24"/>
-        </w:rPr>
-        <w:t>Ejemplo:</w:t>
+      <w:proofErr w:type="gramEnd"/>
+      <w:r>
+        <w:rPr>
+          <w:sz w:val="24"/>
+        </w:rPr>
+        <w:t>\n</w:t>
       </w:r>
     </w:p>
     <w:p>
@@ -1120,22 +1184,20 @@
           <w:sz w:val="24"/>
         </w:rPr>
       </w:pPr>
-      <w:proofErr w:type="spellStart"/>
-      <w:proofErr w:type="gramStart"/>
-      <w:r>
-        <w:rPr>
-          <w:sz w:val="24"/>
-        </w:rPr>
-        <w:t>operation:login</w:t>
-      </w:r>
-      <w:r>
-        <w:rPr>
-          <w:sz w:val="24"/>
-        </w:rPr>
-        <w:t>Ok</w:t>
-      </w:r>
-      <w:proofErr w:type="spellEnd"/>
-      <w:proofErr w:type="gramEnd"/>
+      <w:r>
+        <w:rPr>
+          <w:sz w:val="24"/>
+        </w:rPr>
+        <w:t>sessionkey:7456\n</w:t>
+      </w:r>
+    </w:p>
+    <w:p>
+      <w:pPr>
+        <w:spacing w:after="0"/>
+        <w:rPr>
+          <w:sz w:val="24"/>
+        </w:rPr>
+      </w:pPr>
       <w:r>
         <w:rPr>
           <w:sz w:val="24"/>
@@ -1145,34 +1207,6 @@
     </w:p>
     <w:p>
       <w:pPr>
-        <w:spacing w:after="0"/>
-        <w:rPr>
-          <w:sz w:val="24"/>
-        </w:rPr>
-      </w:pPr>
-      <w:r>
-        <w:rPr>
-          <w:sz w:val="24"/>
-        </w:rPr>
-        <w:t>sessionkey:7456\n</w:t>
-      </w:r>
-    </w:p>
-    <w:p>
-      <w:pPr>
-        <w:spacing w:after="0"/>
-        <w:rPr>
-          <w:sz w:val="24"/>
-        </w:rPr>
-      </w:pPr>
-      <w:r>
-        <w:rPr>
-          <w:sz w:val="24"/>
-        </w:rPr>
-        <w:t>\n</w:t>
-      </w:r>
-    </w:p>
-    <w:p>
-      <w:pPr>
         <w:rPr>
           <w:sz w:val="24"/>
         </w:rPr>
@@ -1209,13 +1243,7 @@
         <w:rPr>
           <w:sz w:val="24"/>
         </w:rPr>
-        <w:t xml:space="preserve">Sentido de la comunicación: </w:t>
-      </w:r>
-      <w:r>
-        <w:rPr>
-          <w:sz w:val="24"/>
-        </w:rPr>
-        <w:t xml:space="preserve">Directorio </w:t>
+        <w:t xml:space="preserve">Sentido de la comunicación: Directorio </w:t>
       </w:r>
       <w:r>
         <w:rPr>
@@ -1546,13 +1574,7 @@
         <w:rPr>
           <w:sz w:val="24"/>
         </w:rPr>
-        <w:t xml:space="preserve">Sentido de la comunicación: </w:t>
-      </w:r>
-      <w:r>
-        <w:rPr>
-          <w:sz w:val="24"/>
-        </w:rPr>
-        <w:t xml:space="preserve">Directorio </w:t>
+        <w:t xml:space="preserve">Sentido de la comunicación: Directorio </w:t>
       </w:r>
       <w:r>
         <w:rPr>
@@ -1688,13 +1710,7 @@
         <w:rPr>
           <w:sz w:val="24"/>
         </w:rPr>
-        <w:t xml:space="preserve">Sentido de la comunicación: </w:t>
-      </w:r>
-      <w:r>
-        <w:rPr>
-          <w:sz w:val="24"/>
-        </w:rPr>
-        <w:t xml:space="preserve">Directorio </w:t>
+        <w:t xml:space="preserve">Sentido de la comunicación: Directorio </w:t>
       </w:r>
       <w:r>
         <w:rPr>
@@ -2003,13 +2019,7 @@
         <w:rPr>
           <w:sz w:val="24"/>
         </w:rPr>
-        <w:t xml:space="preserve">Sentido de la comunicación: </w:t>
-      </w:r>
-      <w:r>
-        <w:rPr>
-          <w:sz w:val="24"/>
-        </w:rPr>
-        <w:t xml:space="preserve">Directorio </w:t>
+        <w:t xml:space="preserve">Sentido de la comunicación: Directorio </w:t>
       </w:r>
       <w:r>
         <w:rPr>
@@ -2195,13 +2205,7 @@
         <w:rPr>
           <w:sz w:val="24"/>
         </w:rPr>
-        <w:t xml:space="preserve">Sentido de la comunicación: </w:t>
-      </w:r>
-      <w:r>
-        <w:rPr>
-          <w:sz w:val="24"/>
-        </w:rPr>
-        <w:t xml:space="preserve">Directorio </w:t>
+        <w:t xml:space="preserve">Sentido de la comunicación: Directorio </w:t>
       </w:r>
       <w:r>
         <w:rPr>
@@ -2323,13 +2327,7 @@
         <w:rPr>
           <w:sz w:val="24"/>
         </w:rPr>
-        <w:t xml:space="preserve">Sentido de la comunicación: </w:t>
-      </w:r>
-      <w:r>
-        <w:rPr>
-          <w:sz w:val="24"/>
-        </w:rPr>
-        <w:t xml:space="preserve">Cliente </w:t>
+        <w:t xml:space="preserve">Sentido de la comunicación: Cliente </w:t>
       </w:r>
       <w:r>
         <w:rPr>
@@ -2462,13 +2460,7 @@
         <w:rPr>
           <w:sz w:val="24"/>
         </w:rPr>
-        <w:t xml:space="preserve">Sentido de comunicación: </w:t>
-      </w:r>
-      <w:r>
-        <w:rPr>
-          <w:sz w:val="24"/>
-        </w:rPr>
-        <w:t xml:space="preserve">Directorio </w:t>
+        <w:t xml:space="preserve">Sentido de comunicación: Directorio </w:t>
       </w:r>
       <w:r>
         <w:rPr>
@@ -2532,13 +2524,7 @@
         <w:rPr>
           <w:sz w:val="24"/>
         </w:rPr>
-        <w:t>Operation:fgserve</w:t>
-      </w:r>
-      <w:r>
-        <w:rPr>
-          <w:sz w:val="24"/>
-        </w:rPr>
-        <w:t>Ok</w:t>
+        <w:t>Operation:fgserveOk</w:t>
       </w:r>
       <w:proofErr w:type="spellEnd"/>
       <w:proofErr w:type="gramEnd"/>
@@ -2626,19 +2612,7 @@
         <w:rPr>
           <w:sz w:val="24"/>
         </w:rPr>
-        <w:t xml:space="preserve">Descripción: Respuesta </w:t>
-      </w:r>
-      <w:r>
-        <w:rPr>
-          <w:sz w:val="24"/>
-        </w:rPr>
-        <w:t>negativa</w:t>
-      </w:r>
-      <w:r>
-        <w:rPr>
-          <w:sz w:val="24"/>
-        </w:rPr>
-        <w:t xml:space="preserve"> del Directorio a la solicitud del cliente a trabajar como servidor de ficheros</w:t>
+        <w:t>Descripción: Respuesta negativa del Directorio a la solicitud del cliente a trabajar como servidor de ficheros</w:t>
       </w:r>
     </w:p>
     <w:p>
@@ -2676,13 +2650,7 @@
         <w:rPr>
           <w:sz w:val="24"/>
         </w:rPr>
-        <w:t>Operation:fgserve</w:t>
-      </w:r>
-      <w:r>
-        <w:rPr>
-          <w:sz w:val="24"/>
-        </w:rPr>
-        <w:t>Fail</w:t>
+        <w:t>Operation:fgserveFail</w:t>
       </w:r>
       <w:proofErr w:type="spellEnd"/>
       <w:proofErr w:type="gramEnd"/>
@@ -2742,6 +2710,915 @@
     <w:p>
       <w:pPr>
         <w:rPr>
+          <w:sz w:val="24"/>
+        </w:rPr>
+      </w:pPr>
+      <w:r>
+        <w:rPr>
+          <w:sz w:val="24"/>
+        </w:rPr>
+        <w:t>MENSAJE:    DOWNLOAD</w:t>
+      </w:r>
+      <w:r>
+        <w:rPr>
+          <w:sz w:val="24"/>
+        </w:rPr>
+        <w:t xml:space="preserve"> </w:t>
+      </w:r>
+    </w:p>
+    <w:p>
+      <w:pPr>
+        <w:rPr>
+          <w:sz w:val="24"/>
+        </w:rPr>
+      </w:pPr>
+      <w:r>
+        <w:rPr>
+          <w:sz w:val="24"/>
+        </w:rPr>
+        <w:t xml:space="preserve">Mensaje:    </w:t>
+      </w:r>
+      <w:proofErr w:type="spellStart"/>
+      <w:r>
+        <w:rPr>
+          <w:sz w:val="24"/>
+        </w:rPr>
+        <w:t>OpCode</w:t>
+      </w:r>
+      <w:proofErr w:type="spellEnd"/>
+      <w:r>
+        <w:rPr>
+          <w:sz w:val="24"/>
+        </w:rPr>
+        <w:t xml:space="preserve"> </w:t>
+      </w:r>
+      <w:r>
+        <w:rPr>
+          <w:sz w:val="24"/>
+        </w:rPr>
+        <w:tab/>
+      </w:r>
+      <w:proofErr w:type="spellStart"/>
+      <w:r>
+        <w:rPr>
+          <w:sz w:val="24"/>
+        </w:rPr>
+        <w:t>Hashlength</w:t>
+      </w:r>
+      <w:proofErr w:type="spellEnd"/>
+      <w:r>
+        <w:rPr>
+          <w:sz w:val="24"/>
+        </w:rPr>
+        <w:tab/>
+      </w:r>
+      <w:proofErr w:type="spellStart"/>
+      <w:r>
+        <w:rPr>
+          <w:sz w:val="24"/>
+        </w:rPr>
+        <w:t>FileHash</w:t>
+      </w:r>
+      <w:proofErr w:type="spellEnd"/>
+    </w:p>
+    <w:p>
+      <w:pPr>
+        <w:rPr>
+          <w:sz w:val="24"/>
+        </w:rPr>
+      </w:pPr>
+      <w:r>
+        <w:rPr>
+          <w:sz w:val="24"/>
+        </w:rPr>
+        <w:t xml:space="preserve">          ---------------------------------------</w:t>
+      </w:r>
+    </w:p>
+    <w:p>
+      <w:pPr>
+        <w:rPr>
+          <w:sz w:val="24"/>
+        </w:rPr>
+      </w:pPr>
+      <w:r>
+        <w:rPr>
+          <w:sz w:val="24"/>
+        </w:rPr>
+        <w:tab/>
+        <w:t xml:space="preserve">    1 </w:t>
+      </w:r>
+      <w:proofErr w:type="gramStart"/>
+      <w:r>
+        <w:rPr>
+          <w:sz w:val="24"/>
+        </w:rPr>
+        <w:t>byte</w:t>
+      </w:r>
+      <w:r>
+        <w:rPr>
+          <w:sz w:val="24"/>
+        </w:rPr>
+        <w:t>(</w:t>
+      </w:r>
+      <w:proofErr w:type="gramEnd"/>
+      <w:r>
+        <w:rPr>
+          <w:sz w:val="24"/>
+        </w:rPr>
+        <w:t>1)    1 byte          n bytes</w:t>
+      </w:r>
+    </w:p>
+    <w:p>
+      <w:pPr>
+        <w:rPr>
+          <w:sz w:val="24"/>
+        </w:rPr>
+      </w:pPr>
+      <w:r>
+        <w:rPr>
+          <w:sz w:val="24"/>
+        </w:rPr>
+        <w:t>Formato</w:t>
+      </w:r>
+      <w:r>
+        <w:rPr>
+          <w:sz w:val="24"/>
+        </w:rPr>
+        <w:t>: TLV</w:t>
+      </w:r>
+    </w:p>
+    <w:p>
+      <w:pPr>
+        <w:rPr>
+          <w:sz w:val="24"/>
+        </w:rPr>
+      </w:pPr>
+      <w:r>
+        <w:rPr>
+          <w:sz w:val="24"/>
+        </w:rPr>
+        <w:t>Dirección</w:t>
+      </w:r>
+      <w:r>
+        <w:rPr>
+          <w:sz w:val="24"/>
+        </w:rPr>
+        <w:t>: peer cliente -&gt; peer servidor</w:t>
+      </w:r>
+    </w:p>
+    <w:p>
+      <w:pPr>
+        <w:rPr>
+          <w:sz w:val="24"/>
+        </w:rPr>
+      </w:pPr>
+      <w:r>
+        <w:rPr>
+          <w:sz w:val="24"/>
+        </w:rPr>
+        <w:t>Descripción: Este mensaje lo envía el peer cli</w:t>
+      </w:r>
+      <w:r>
+        <w:rPr>
+          <w:sz w:val="24"/>
+        </w:rPr>
+        <w:t>e</w:t>
+      </w:r>
+      <w:r>
+        <w:rPr>
+          <w:sz w:val="24"/>
+        </w:rPr>
+        <w:t>n</w:t>
+      </w:r>
+      <w:r>
+        <w:rPr>
+          <w:sz w:val="24"/>
+        </w:rPr>
+        <w:t>te al peer servi</w:t>
+      </w:r>
+      <w:r>
+        <w:rPr>
+          <w:sz w:val="24"/>
+        </w:rPr>
+        <w:t>d</w:t>
+      </w:r>
+      <w:r>
+        <w:rPr>
+          <w:sz w:val="24"/>
+        </w:rPr>
+        <w:t>o</w:t>
+      </w:r>
+      <w:r>
+        <w:rPr>
+          <w:sz w:val="24"/>
+        </w:rPr>
+        <w:t xml:space="preserve">r de ficheros para la solicitud </w:t>
+      </w:r>
+      <w:r>
+        <w:rPr>
+          <w:sz w:val="24"/>
+        </w:rPr>
+        <w:t>de descarga de un fichero a</w:t>
+      </w:r>
+      <w:r>
+        <w:rPr>
+          <w:sz w:val="24"/>
+        </w:rPr>
+        <w:t xml:space="preserve"> partir de un hash (o parte de é</w:t>
+      </w:r>
+      <w:r>
+        <w:rPr>
+          <w:sz w:val="24"/>
+        </w:rPr>
+        <w:t>l)</w:t>
+      </w:r>
+    </w:p>
+    <w:p>
+      <w:pPr>
+        <w:rPr>
+          <w:sz w:val="24"/>
+        </w:rPr>
+      </w:pPr>
+      <w:r>
+        <w:rPr>
+          <w:sz w:val="24"/>
+        </w:rPr>
+        <w:t xml:space="preserve">Ejemplo:  </w:t>
+      </w:r>
+      <w:proofErr w:type="spellStart"/>
+      <w:r>
+        <w:rPr>
+          <w:sz w:val="24"/>
+        </w:rPr>
+        <w:t>OpCode</w:t>
+      </w:r>
+      <w:proofErr w:type="spellEnd"/>
+      <w:r>
+        <w:rPr>
+          <w:sz w:val="24"/>
+        </w:rPr>
+        <w:t xml:space="preserve"> </w:t>
+      </w:r>
+      <w:r>
+        <w:rPr>
+          <w:sz w:val="24"/>
+        </w:rPr>
+        <w:tab/>
+      </w:r>
+      <w:proofErr w:type="spellStart"/>
+      <w:r>
+        <w:rPr>
+          <w:sz w:val="24"/>
+        </w:rPr>
+        <w:t>Hashlength</w:t>
+      </w:r>
+      <w:proofErr w:type="spellEnd"/>
+      <w:r>
+        <w:rPr>
+          <w:sz w:val="24"/>
+        </w:rPr>
+        <w:tab/>
+      </w:r>
+      <w:proofErr w:type="spellStart"/>
+      <w:r>
+        <w:rPr>
+          <w:sz w:val="24"/>
+        </w:rPr>
+        <w:t>FileHash</w:t>
+      </w:r>
+      <w:proofErr w:type="spellEnd"/>
+    </w:p>
+    <w:p>
+      <w:pPr>
+        <w:rPr>
+          <w:sz w:val="24"/>
+        </w:rPr>
+      </w:pPr>
+      <w:r>
+        <w:rPr>
+          <w:sz w:val="24"/>
+        </w:rPr>
+        <w:t xml:space="preserve">          ---------------------------------------</w:t>
+      </w:r>
+    </w:p>
+    <w:p>
+      <w:pPr>
+        <w:rPr>
+          <w:sz w:val="24"/>
+        </w:rPr>
+      </w:pPr>
+      <w:r>
+        <w:rPr>
+          <w:sz w:val="24"/>
+        </w:rPr>
+        <w:tab/>
+        <w:t xml:space="preserve">     1    </w:t>
+      </w:r>
+      <w:r>
+        <w:rPr>
+          <w:sz w:val="24"/>
+        </w:rPr>
+        <w:t xml:space="preserve">         4             "3gy6"  </w:t>
+      </w:r>
+    </w:p>
+    <w:p>
+      <w:pPr>
+        <w:rPr>
+          <w:sz w:val="24"/>
+        </w:rPr>
+      </w:pPr>
+      <w:r>
+        <w:rPr>
+          <w:sz w:val="24"/>
+        </w:rPr>
+        <w:t>MENSAJE</w:t>
+      </w:r>
+      <w:r>
+        <w:rPr>
+          <w:sz w:val="24"/>
+        </w:rPr>
+        <w:t>:  FILENOTFOUND</w:t>
+      </w:r>
+    </w:p>
+    <w:p>
+      <w:pPr>
+        <w:rPr>
+          <w:sz w:val="24"/>
+        </w:rPr>
+      </w:pPr>
+      <w:r>
+        <w:rPr>
+          <w:sz w:val="24"/>
+        </w:rPr>
+        <w:t xml:space="preserve">Mensaje:  </w:t>
+      </w:r>
+      <w:proofErr w:type="spellStart"/>
+      <w:r>
+        <w:rPr>
+          <w:sz w:val="24"/>
+        </w:rPr>
+        <w:t>OpCode</w:t>
+      </w:r>
+      <w:proofErr w:type="spellEnd"/>
+      <w:r>
+        <w:rPr>
+          <w:sz w:val="24"/>
+        </w:rPr>
+        <w:t xml:space="preserve"> </w:t>
+      </w:r>
+    </w:p>
+    <w:p>
+      <w:pPr>
+        <w:rPr>
+          <w:sz w:val="24"/>
+        </w:rPr>
+      </w:pPr>
+      <w:r>
+        <w:rPr>
+          <w:sz w:val="24"/>
+        </w:rPr>
+        <w:tab/>
+        <w:t>----------</w:t>
+      </w:r>
+    </w:p>
+    <w:p>
+      <w:pPr>
+        <w:rPr>
+          <w:sz w:val="24"/>
+        </w:rPr>
+      </w:pPr>
+      <w:r>
+        <w:rPr>
+          <w:sz w:val="24"/>
+        </w:rPr>
+        <w:tab/>
+        <w:t xml:space="preserve"> 1 </w:t>
+      </w:r>
+      <w:proofErr w:type="gramStart"/>
+      <w:r>
+        <w:rPr>
+          <w:sz w:val="24"/>
+        </w:rPr>
+        <w:t>byte(</w:t>
+      </w:r>
+      <w:proofErr w:type="gramEnd"/>
+      <w:r>
+        <w:rPr>
+          <w:sz w:val="24"/>
+        </w:rPr>
+        <w:t>3)</w:t>
+      </w:r>
+    </w:p>
+    <w:p>
+      <w:pPr>
+        <w:rPr>
+          <w:sz w:val="24"/>
+        </w:rPr>
+      </w:pPr>
+      <w:r>
+        <w:rPr>
+          <w:sz w:val="24"/>
+        </w:rPr>
+        <w:t>Formato</w:t>
+      </w:r>
+      <w:r>
+        <w:rPr>
+          <w:sz w:val="24"/>
+        </w:rPr>
+        <w:t>: CONTROL</w:t>
+      </w:r>
+    </w:p>
+    <w:p>
+      <w:pPr>
+        <w:rPr>
+          <w:sz w:val="24"/>
+        </w:rPr>
+      </w:pPr>
+      <w:r>
+        <w:rPr>
+          <w:sz w:val="24"/>
+        </w:rPr>
+        <w:t>Sentido de la comunicación</w:t>
+      </w:r>
+      <w:r>
+        <w:rPr>
+          <w:sz w:val="24"/>
+        </w:rPr>
+        <w:t xml:space="preserve">: peer servidor de ficheros -&gt; peer cliente </w:t>
+      </w:r>
+    </w:p>
+    <w:p>
+      <w:pPr>
+        <w:rPr>
+          <w:sz w:val="24"/>
+        </w:rPr>
+      </w:pPr>
+      <w:r>
+        <w:rPr>
+          <w:sz w:val="24"/>
+        </w:rPr>
+        <w:t>Descripción</w:t>
+      </w:r>
+      <w:r>
+        <w:rPr>
+          <w:sz w:val="24"/>
+        </w:rPr>
+        <w:t xml:space="preserve">: Este mensaje lo envía el par servidor de ficheros al par cliente (receptor) de </w:t>
+      </w:r>
+    </w:p>
+    <w:p>
+      <w:pPr>
+        <w:rPr>
+          <w:sz w:val="24"/>
+        </w:rPr>
+      </w:pPr>
+      <w:r>
+        <w:rPr>
+          <w:sz w:val="24"/>
+        </w:rPr>
+        <w:tab/>
+        <w:t xml:space="preserve">      fichero para indicar que no es posible encontrar el fichero con la información proporcionada </w:t>
+      </w:r>
+    </w:p>
+    <w:p>
+      <w:pPr>
+        <w:rPr>
+          <w:sz w:val="24"/>
+        </w:rPr>
+      </w:pPr>
+      <w:r>
+        <w:rPr>
+          <w:sz w:val="24"/>
+        </w:rPr>
+        <w:tab/>
+        <w:t xml:space="preserve">      en el mensaje de petición de </w:t>
+      </w:r>
+      <w:r>
+        <w:rPr>
+          <w:sz w:val="24"/>
+        </w:rPr>
+        <w:t>descarga. Supondremos que tambié</w:t>
+      </w:r>
+      <w:r>
+        <w:rPr>
+          <w:sz w:val="24"/>
+        </w:rPr>
+        <w:t>n se incluye en este mensaje</w:t>
+      </w:r>
+    </w:p>
+    <w:p>
+      <w:pPr>
+        <w:rPr>
+          <w:sz w:val="24"/>
+        </w:rPr>
+      </w:pPr>
+      <w:r>
+        <w:rPr>
+          <w:sz w:val="24"/>
+        </w:rPr>
+        <w:tab/>
+        <w:t xml:space="preserve">      la posible ambigü</w:t>
+      </w:r>
+      <w:r>
+        <w:rPr>
+          <w:sz w:val="24"/>
+        </w:rPr>
+        <w:t>edad que pueda haber.</w:t>
+      </w:r>
+    </w:p>
+    <w:p>
+      <w:pPr>
+        <w:rPr>
+          <w:sz w:val="24"/>
+        </w:rPr>
+      </w:pPr>
+      <w:r>
+        <w:rPr>
+          <w:sz w:val="24"/>
+        </w:rPr>
+        <w:t>Ejemplo</w:t>
+      </w:r>
+      <w:r>
+        <w:rPr>
+          <w:sz w:val="24"/>
+        </w:rPr>
+        <w:t xml:space="preserve">:   </w:t>
+      </w:r>
+      <w:proofErr w:type="spellStart"/>
+      <w:r>
+        <w:rPr>
+          <w:sz w:val="24"/>
+        </w:rPr>
+        <w:t>OpCode</w:t>
+      </w:r>
+      <w:proofErr w:type="spellEnd"/>
+    </w:p>
+    <w:p>
+      <w:pPr>
+        <w:rPr>
+          <w:sz w:val="24"/>
+        </w:rPr>
+      </w:pPr>
+      <w:r>
+        <w:rPr>
+          <w:sz w:val="24"/>
+        </w:rPr>
+        <w:tab/>
+        <w:t xml:space="preserve">   ---------</w:t>
+      </w:r>
+    </w:p>
+    <w:p>
+      <w:pPr>
+        <w:rPr>
+          <w:sz w:val="24"/>
+        </w:rPr>
+      </w:pPr>
+      <w:r>
+        <w:rPr>
+          <w:sz w:val="24"/>
+        </w:rPr>
+        <w:tab/>
+        <w:t xml:space="preserve">      3</w:t>
+      </w:r>
+    </w:p>
+    <w:p>
+      <w:pPr>
+        <w:rPr>
+          <w:sz w:val="24"/>
+        </w:rPr>
+      </w:pPr>
+    </w:p>
+    <w:p>
+      <w:pPr>
+        <w:rPr>
+          <w:sz w:val="24"/>
+        </w:rPr>
+      </w:pPr>
+    </w:p>
+    <w:p>
+      <w:pPr>
+        <w:rPr>
+          <w:sz w:val="24"/>
+        </w:rPr>
+      </w:pPr>
+    </w:p>
+    <w:p>
+      <w:pPr>
+        <w:rPr>
+          <w:sz w:val="24"/>
+        </w:rPr>
+      </w:pPr>
+      <w:r>
+        <w:rPr>
+          <w:sz w:val="24"/>
+        </w:rPr>
+        <w:t>MENSAJE</w:t>
+      </w:r>
+      <w:r>
+        <w:rPr>
+          <w:sz w:val="24"/>
+        </w:rPr>
+        <w:t>:  FILEDATA</w:t>
+      </w:r>
+    </w:p>
+    <w:p>
+      <w:pPr>
+        <w:rPr>
+          <w:sz w:val="24"/>
+        </w:rPr>
+      </w:pPr>
+      <w:r>
+        <w:rPr>
+          <w:sz w:val="24"/>
+        </w:rPr>
+        <w:t xml:space="preserve">Mensaje:  </w:t>
+      </w:r>
+      <w:proofErr w:type="spellStart"/>
+      <w:r>
+        <w:rPr>
+          <w:sz w:val="24"/>
+        </w:rPr>
+        <w:t>OpCode</w:t>
+      </w:r>
+      <w:proofErr w:type="spellEnd"/>
+      <w:r>
+        <w:rPr>
+          <w:sz w:val="24"/>
+        </w:rPr>
+        <w:t xml:space="preserve"> </w:t>
+      </w:r>
+      <w:r>
+        <w:rPr>
+          <w:sz w:val="24"/>
+        </w:rPr>
+        <w:tab/>
+      </w:r>
+      <w:proofErr w:type="spellStart"/>
+      <w:r>
+        <w:rPr>
+          <w:sz w:val="24"/>
+        </w:rPr>
+        <w:t>Datalength</w:t>
+      </w:r>
+      <w:proofErr w:type="spellEnd"/>
+      <w:r>
+        <w:rPr>
+          <w:sz w:val="24"/>
+        </w:rPr>
+        <w:tab/>
+      </w:r>
+      <w:proofErr w:type="spellStart"/>
+      <w:r>
+        <w:rPr>
+          <w:sz w:val="24"/>
+        </w:rPr>
+        <w:t>FileData</w:t>
+      </w:r>
+      <w:proofErr w:type="spellEnd"/>
+    </w:p>
+    <w:p>
+      <w:pPr>
+        <w:rPr>
+          <w:sz w:val="24"/>
+        </w:rPr>
+      </w:pPr>
+      <w:r>
+        <w:rPr>
+          <w:sz w:val="24"/>
+        </w:rPr>
+        <w:t xml:space="preserve">          ---------------------------------------</w:t>
+      </w:r>
+    </w:p>
+    <w:p>
+      <w:pPr>
+        <w:rPr>
+          <w:sz w:val="24"/>
+        </w:rPr>
+      </w:pPr>
+      <w:r>
+        <w:rPr>
+          <w:sz w:val="24"/>
+        </w:rPr>
+        <w:tab/>
+        <w:t xml:space="preserve">   1 </w:t>
+      </w:r>
+      <w:proofErr w:type="gramStart"/>
+      <w:r>
+        <w:rPr>
+          <w:sz w:val="24"/>
+        </w:rPr>
+        <w:t>byte</w:t>
+      </w:r>
+      <w:r>
+        <w:rPr>
+          <w:sz w:val="24"/>
+        </w:rPr>
+        <w:t>(</w:t>
+      </w:r>
+      <w:proofErr w:type="gramEnd"/>
+      <w:r>
+        <w:rPr>
+          <w:sz w:val="24"/>
+        </w:rPr>
+        <w:t>2)    1/2/4/8 bytes   n bytes</w:t>
+      </w:r>
+    </w:p>
+    <w:p>
+      <w:pPr>
+        <w:rPr>
+          <w:sz w:val="24"/>
+        </w:rPr>
+      </w:pPr>
+      <w:r>
+        <w:rPr>
+          <w:sz w:val="24"/>
+        </w:rPr>
+        <w:t>Formato</w:t>
+      </w:r>
+      <w:r>
+        <w:rPr>
+          <w:sz w:val="24"/>
+        </w:rPr>
+        <w:t>: TLV</w:t>
+      </w:r>
+    </w:p>
+    <w:p>
+      <w:pPr>
+        <w:rPr>
+          <w:sz w:val="24"/>
+        </w:rPr>
+      </w:pPr>
+      <w:r>
+        <w:rPr>
+          <w:sz w:val="24"/>
+        </w:rPr>
+        <w:t>Sentido de la comunicación</w:t>
+      </w:r>
+      <w:r>
+        <w:rPr>
+          <w:sz w:val="24"/>
+        </w:rPr>
+        <w:t>: peer se</w:t>
+      </w:r>
+      <w:r>
+        <w:rPr>
+          <w:sz w:val="24"/>
+        </w:rPr>
+        <w:t>r</w:t>
+      </w:r>
+      <w:r>
+        <w:rPr>
+          <w:sz w:val="24"/>
+        </w:rPr>
+        <w:t>vidor</w:t>
+      </w:r>
+      <w:r>
+        <w:rPr>
+          <w:sz w:val="24"/>
+        </w:rPr>
+        <w:t xml:space="preserve"> de ficheros -&gt; peer cli</w:t>
+      </w:r>
+      <w:r>
+        <w:rPr>
+          <w:sz w:val="24"/>
+        </w:rPr>
+        <w:t>e</w:t>
+      </w:r>
+      <w:r>
+        <w:rPr>
+          <w:sz w:val="24"/>
+        </w:rPr>
+        <w:t>n</w:t>
+      </w:r>
+      <w:r>
+        <w:rPr>
+          <w:sz w:val="24"/>
+        </w:rPr>
+        <w:t>te</w:t>
+      </w:r>
+    </w:p>
+    <w:p>
+      <w:pPr>
+        <w:rPr>
+          <w:sz w:val="24"/>
+        </w:rPr>
+      </w:pPr>
+      <w:r>
+        <w:rPr>
+          <w:sz w:val="24"/>
+        </w:rPr>
+        <w:t>Descripción: Este mensaje lo enví</w:t>
+      </w:r>
+      <w:r>
+        <w:rPr>
+          <w:sz w:val="24"/>
+        </w:rPr>
+        <w:t>a el peer servidor de ficheros a</w:t>
+      </w:r>
+      <w:r>
+        <w:rPr>
+          <w:sz w:val="24"/>
+        </w:rPr>
+        <w:t xml:space="preserve">l peer cliente entregándole el </w:t>
+      </w:r>
+      <w:r>
+        <w:rPr>
+          <w:sz w:val="24"/>
+        </w:rPr>
+        <w:t>archivo que el peer solicito descargar.</w:t>
+      </w:r>
+    </w:p>
+    <w:p>
+      <w:pPr>
+        <w:rPr>
+          <w:sz w:val="24"/>
+        </w:rPr>
+      </w:pPr>
+      <w:r>
+        <w:rPr>
+          <w:sz w:val="24"/>
+        </w:rPr>
+        <w:t xml:space="preserve">Ejemplo: </w:t>
+      </w:r>
+      <w:proofErr w:type="spellStart"/>
+      <w:r>
+        <w:rPr>
+          <w:sz w:val="24"/>
+        </w:rPr>
+        <w:t>OpCode</w:t>
+      </w:r>
+      <w:proofErr w:type="spellEnd"/>
+      <w:r>
+        <w:rPr>
+          <w:sz w:val="24"/>
+        </w:rPr>
+        <w:t xml:space="preserve"> </w:t>
+      </w:r>
+      <w:r>
+        <w:rPr>
+          <w:sz w:val="24"/>
+        </w:rPr>
+        <w:tab/>
+      </w:r>
+      <w:proofErr w:type="spellStart"/>
+      <w:r>
+        <w:rPr>
+          <w:sz w:val="24"/>
+        </w:rPr>
+        <w:t>Datalength</w:t>
+      </w:r>
+      <w:proofErr w:type="spellEnd"/>
+      <w:r>
+        <w:rPr>
+          <w:sz w:val="24"/>
+        </w:rPr>
+        <w:tab/>
+      </w:r>
+      <w:proofErr w:type="spellStart"/>
+      <w:r>
+        <w:rPr>
+          <w:sz w:val="24"/>
+        </w:rPr>
+        <w:t>FileData</w:t>
+      </w:r>
+      <w:proofErr w:type="spellEnd"/>
+    </w:p>
+    <w:p>
+      <w:pPr>
+        <w:rPr>
+          <w:sz w:val="24"/>
+        </w:rPr>
+      </w:pPr>
+      <w:r>
+        <w:rPr>
+          <w:sz w:val="24"/>
+        </w:rPr>
+        <w:t xml:space="preserve">          ---------------------------------------</w:t>
+      </w:r>
+    </w:p>
+    <w:p>
+      <w:pPr>
+        <w:rPr>
+          <w:sz w:val="24"/>
+        </w:rPr>
+      </w:pPr>
+      <w:r>
+        <w:rPr>
+          <w:sz w:val="24"/>
+        </w:rPr>
+        <w:tab/>
+        <w:t xml:space="preserve">    2             23       ho</w:t>
+      </w:r>
+      <w:r>
+        <w:rPr>
+          <w:sz w:val="24"/>
+        </w:rPr>
+        <w:t>la esto es una prueba</w:t>
+      </w:r>
+    </w:p>
+    <w:p>
+      <w:pPr>
+        <w:rPr>
           <w:sz w:val="40"/>
         </w:rPr>
       </w:pPr>
@@ -2751,6 +3628,13 @@
         </w:rPr>
         <w:br w:type="page"/>
       </w:r>
+    </w:p>
+    <w:p>
+      <w:pPr>
+        <w:rPr>
+          <w:sz w:val="40"/>
+        </w:rPr>
+      </w:pPr>
     </w:p>
     <w:p>
       <w:pPr>
@@ -2767,7 +3651,6 @@
         <w:rPr>
           <w:sz w:val="40"/>
         </w:rPr>
-        <w:lastRenderedPageBreak/>
         <w:t>Autómatas de protocolo</w:t>
       </w:r>
     </w:p>
@@ -3110,14 +3993,85 @@
           <w:sz w:val="24"/>
         </w:rPr>
       </w:pPr>
-      <w:r>
-        <w:rPr>
-          <w:sz w:val="24"/>
-        </w:rPr>
-        <w:t>Autómata rol servidor de directorio:</w:t>
-      </w:r>
+    </w:p>
+    <w:p>
+      <w:pPr>
+        <w:rPr>
+          <w:sz w:val="24"/>
+        </w:rPr>
+      </w:pPr>
+    </w:p>
+    <w:p>
+      <w:pPr>
+        <w:rPr>
+          <w:sz w:val="24"/>
+        </w:rPr>
+      </w:pPr>
+    </w:p>
+    <w:p>
+      <w:pPr>
+        <w:rPr>
+          <w:sz w:val="24"/>
+        </w:rPr>
+      </w:pPr>
+    </w:p>
+    <w:p>
+      <w:pPr>
+        <w:rPr>
+          <w:sz w:val="24"/>
+        </w:rPr>
+      </w:pPr>
+    </w:p>
+    <w:p>
+      <w:pPr>
+        <w:rPr>
+          <w:sz w:val="24"/>
+        </w:rPr>
+      </w:pPr>
+    </w:p>
+    <w:p>
+      <w:pPr>
+        <w:rPr>
+          <w:sz w:val="24"/>
+        </w:rPr>
+      </w:pPr>
+    </w:p>
+    <w:p>
+      <w:pPr>
+        <w:rPr>
+          <w:sz w:val="24"/>
+        </w:rPr>
+      </w:pPr>
+    </w:p>
+    <w:p>
+      <w:pPr>
+        <w:rPr>
+          <w:sz w:val="24"/>
+        </w:rPr>
+      </w:pPr>
+    </w:p>
+    <w:p>
+      <w:pPr>
+        <w:rPr>
+          <w:sz w:val="24"/>
+        </w:rPr>
+      </w:pPr>
+    </w:p>
+    <w:p>
+      <w:pPr>
+        <w:rPr>
+          <w:sz w:val="24"/>
+        </w:rPr>
+      </w:pPr>
       <w:bookmarkStart w:id="0" w:name="_GoBack"/>
       <w:bookmarkEnd w:id="0"/>
+      <w:r>
+        <w:rPr>
+          <w:sz w:val="24"/>
+        </w:rPr>
+        <w:lastRenderedPageBreak/>
+        <w:t>Autómata rol servidor de directorio:</w:t>
+      </w:r>
     </w:p>
     <w:p>
       <w:pPr>
@@ -3450,6 +4404,7 @@
           <w:sz w:val="24"/>
           <w:lang w:eastAsia="es-ES"/>
         </w:rPr>
+        <w:lastRenderedPageBreak/>
         <w:drawing>
           <wp:anchor distT="0" distB="0" distL="114300" distR="114300" simplePos="0" relativeHeight="251668480" behindDoc="0" locked="0" layoutInCell="1" allowOverlap="1" wp14:anchorId="68027AAB" wp14:editId="4228DF11">
             <wp:simplePos x="0" y="0"/>
@@ -3783,23 +4738,7 @@
           <w:sz w:val="24"/>
           <w:szCs w:val="24"/>
         </w:rPr>
-        <w:t xml:space="preserve">DIRECTORIO: </w:t>
-      </w:r>
-      <w:r>
-        <w:rPr>
-          <w:rFonts w:eastAsia="Liberation Serif" w:cs="Liberation Serif"/>
-          <w:sz w:val="24"/>
-          <w:szCs w:val="24"/>
-        </w:rPr>
-        <w:t>confirma</w:t>
-      </w:r>
-      <w:r>
-        <w:rPr>
-          <w:rFonts w:eastAsia="Liberation Serif" w:cs="Liberation Serif"/>
-          <w:sz w:val="24"/>
-          <w:szCs w:val="24"/>
-        </w:rPr>
-        <w:t xml:space="preserve"> inicio de sesión</w:t>
+        <w:t>DIRECTORIO: confirma inicio de sesión</w:t>
       </w:r>
     </w:p>
     <w:p>
@@ -3821,7 +4760,434 @@
         <w:rPr>
           <w:sz w:val="24"/>
         </w:rPr>
-        <w:t>:</w:t>
+        <w:t xml:space="preserve">: </w:t>
+      </w:r>
+      <w:proofErr w:type="spellStart"/>
+      <w:r>
+        <w:rPr>
+          <w:sz w:val="24"/>
+        </w:rPr>
+        <w:t>loginOk</w:t>
+      </w:r>
+      <w:proofErr w:type="spellEnd"/>
+    </w:p>
+    <w:p>
+      <w:pPr>
+        <w:spacing w:after="0"/>
+        <w:rPr>
+          <w:sz w:val="24"/>
+        </w:rPr>
+      </w:pPr>
+      <w:proofErr w:type="spellStart"/>
+      <w:r>
+        <w:rPr>
+          <w:sz w:val="24"/>
+        </w:rPr>
+        <w:t>sessionkey</w:t>
+      </w:r>
+      <w:proofErr w:type="spellEnd"/>
+      <w:r>
+        <w:rPr>
+          <w:sz w:val="24"/>
+        </w:rPr>
+        <w:t>: 6420</w:t>
+      </w:r>
+    </w:p>
+    <w:p>
+      <w:pPr>
+        <w:rPr>
+          <w:sz w:val="24"/>
+        </w:rPr>
+      </w:pPr>
+    </w:p>
+    <w:p>
+      <w:pPr>
+        <w:rPr>
+          <w:sz w:val="24"/>
+        </w:rPr>
+      </w:pPr>
+      <w:r>
+        <w:rPr>
+          <w:sz w:val="24"/>
+        </w:rPr>
+        <w:t>CLIENTE: pide la lista de usuarios</w:t>
+      </w:r>
+    </w:p>
+    <w:p>
+      <w:pPr>
+        <w:spacing w:after="0"/>
+        <w:rPr>
+          <w:sz w:val="24"/>
+        </w:rPr>
+      </w:pPr>
+      <w:proofErr w:type="spellStart"/>
+      <w:r>
+        <w:rPr>
+          <w:sz w:val="24"/>
+        </w:rPr>
+        <w:t>operation</w:t>
+      </w:r>
+      <w:proofErr w:type="spellEnd"/>
+      <w:r>
+        <w:rPr>
+          <w:sz w:val="24"/>
+        </w:rPr>
+        <w:t xml:space="preserve">: </w:t>
+      </w:r>
+      <w:proofErr w:type="spellStart"/>
+      <w:r>
+        <w:rPr>
+          <w:sz w:val="24"/>
+        </w:rPr>
+        <w:t>userlist</w:t>
+      </w:r>
+      <w:proofErr w:type="spellEnd"/>
+    </w:p>
+    <w:p>
+      <w:pPr>
+        <w:spacing w:after="0"/>
+        <w:rPr>
+          <w:sz w:val="24"/>
+        </w:rPr>
+      </w:pPr>
+      <w:proofErr w:type="spellStart"/>
+      <w:r>
+        <w:rPr>
+          <w:sz w:val="24"/>
+        </w:rPr>
+        <w:t>sessionkey</w:t>
+      </w:r>
+      <w:proofErr w:type="spellEnd"/>
+      <w:r>
+        <w:rPr>
+          <w:sz w:val="24"/>
+        </w:rPr>
+        <w:t>: 6420</w:t>
+      </w:r>
+    </w:p>
+    <w:p>
+      <w:pPr>
+        <w:rPr>
+          <w:sz w:val="24"/>
+        </w:rPr>
+      </w:pPr>
+    </w:p>
+    <w:p>
+      <w:pPr>
+        <w:rPr>
+          <w:sz w:val="24"/>
+        </w:rPr>
+      </w:pPr>
+      <w:r>
+        <w:rPr>
+          <w:sz w:val="24"/>
+        </w:rPr>
+        <w:t>DIRECTORIO</w:t>
+      </w:r>
+      <w:r>
+        <w:rPr>
+          <w:sz w:val="24"/>
+        </w:rPr>
+        <w:t>: devuelve la lista de usuarios</w:t>
+      </w:r>
+    </w:p>
+    <w:p>
+      <w:pPr>
+        <w:spacing w:after="0"/>
+        <w:rPr>
+          <w:sz w:val="24"/>
+        </w:rPr>
+      </w:pPr>
+      <w:proofErr w:type="spellStart"/>
+      <w:r>
+        <w:rPr>
+          <w:sz w:val="24"/>
+        </w:rPr>
+        <w:t>operation</w:t>
+      </w:r>
+      <w:proofErr w:type="spellEnd"/>
+      <w:r>
+        <w:rPr>
+          <w:sz w:val="24"/>
+        </w:rPr>
+        <w:t xml:space="preserve">: </w:t>
+      </w:r>
+      <w:proofErr w:type="spellStart"/>
+      <w:r>
+        <w:rPr>
+          <w:sz w:val="24"/>
+        </w:rPr>
+        <w:t>userlistOk</w:t>
+      </w:r>
+      <w:proofErr w:type="spellEnd"/>
+    </w:p>
+    <w:p>
+      <w:pPr>
+        <w:spacing w:after="0"/>
+        <w:rPr>
+          <w:sz w:val="24"/>
+        </w:rPr>
+      </w:pPr>
+      <w:proofErr w:type="spellStart"/>
+      <w:r>
+        <w:rPr>
+          <w:sz w:val="24"/>
+        </w:rPr>
+        <w:t>users</w:t>
+      </w:r>
+      <w:proofErr w:type="spellEnd"/>
+      <w:r>
+        <w:rPr>
+          <w:sz w:val="24"/>
+        </w:rPr>
+        <w:t>: Dio</w:t>
+      </w:r>
+    </w:p>
+    <w:p>
+      <w:pPr>
+        <w:rPr>
+          <w:sz w:val="24"/>
+        </w:rPr>
+      </w:pPr>
+    </w:p>
+    <w:p>
+      <w:pPr>
+        <w:rPr>
+          <w:sz w:val="24"/>
+        </w:rPr>
+      </w:pPr>
+      <w:r>
+        <w:rPr>
+          <w:sz w:val="24"/>
+        </w:rPr>
+        <w:t>DIRECTORIO</w:t>
+      </w:r>
+      <w:r>
+        <w:rPr>
+          <w:sz w:val="24"/>
+        </w:rPr>
+        <w:t xml:space="preserve">: rechaza la </w:t>
+      </w:r>
+      <w:proofErr w:type="gramStart"/>
+      <w:r>
+        <w:rPr>
+          <w:sz w:val="24"/>
+        </w:rPr>
+        <w:t>operación(</w:t>
+      </w:r>
+      <w:proofErr w:type="spellStart"/>
+      <w:proofErr w:type="gramEnd"/>
+      <w:r>
+        <w:rPr>
+          <w:sz w:val="24"/>
+        </w:rPr>
+        <w:t>nunta</w:t>
+      </w:r>
+      <w:proofErr w:type="spellEnd"/>
+      <w:r>
+        <w:rPr>
+          <w:sz w:val="24"/>
+        </w:rPr>
+        <w:t xml:space="preserve"> debería pasar ya que para hacer </w:t>
+      </w:r>
+      <w:proofErr w:type="spellStart"/>
+      <w:r>
+        <w:rPr>
+          <w:sz w:val="24"/>
+        </w:rPr>
+        <w:t>userlist</w:t>
+      </w:r>
+      <w:proofErr w:type="spellEnd"/>
+      <w:r>
+        <w:rPr>
+          <w:sz w:val="24"/>
+        </w:rPr>
+        <w:t xml:space="preserve"> tiene que estar registrado el usuario y por tanto siempre va a haber como minimo 1 usuario registrado a la hora de procesar el </w:t>
+      </w:r>
+      <w:proofErr w:type="spellStart"/>
+      <w:r>
+        <w:rPr>
+          <w:sz w:val="24"/>
+        </w:rPr>
+        <w:t>userlist</w:t>
+      </w:r>
+      <w:proofErr w:type="spellEnd"/>
+      <w:r>
+        <w:rPr>
+          <w:sz w:val="24"/>
+        </w:rPr>
+        <w:t>)</w:t>
+      </w:r>
+    </w:p>
+    <w:p>
+      <w:pPr>
+        <w:rPr>
+          <w:sz w:val="24"/>
+        </w:rPr>
+      </w:pPr>
+      <w:proofErr w:type="spellStart"/>
+      <w:r>
+        <w:rPr>
+          <w:sz w:val="24"/>
+        </w:rPr>
+        <w:t>operation</w:t>
+      </w:r>
+      <w:proofErr w:type="spellEnd"/>
+      <w:r>
+        <w:rPr>
+          <w:sz w:val="24"/>
+        </w:rPr>
+        <w:t xml:space="preserve">: </w:t>
+      </w:r>
+      <w:proofErr w:type="spellStart"/>
+      <w:r>
+        <w:rPr>
+          <w:sz w:val="24"/>
+        </w:rPr>
+        <w:t>userlistFail</w:t>
+      </w:r>
+      <w:proofErr w:type="spellEnd"/>
+    </w:p>
+    <w:p>
+      <w:pPr>
+        <w:rPr>
+          <w:sz w:val="24"/>
+        </w:rPr>
+      </w:pPr>
+    </w:p>
+    <w:p>
+      <w:pPr>
+        <w:rPr>
+          <w:sz w:val="24"/>
+        </w:rPr>
+      </w:pPr>
+      <w:r>
+        <w:rPr>
+          <w:sz w:val="24"/>
+        </w:rPr>
+        <w:t>CLIENTE: solicita cerrar su sesión en el Directorio</w:t>
+      </w:r>
+    </w:p>
+    <w:p>
+      <w:pPr>
+        <w:spacing w:after="0"/>
+        <w:rPr>
+          <w:sz w:val="24"/>
+        </w:rPr>
+      </w:pPr>
+      <w:proofErr w:type="spellStart"/>
+      <w:r>
+        <w:rPr>
+          <w:sz w:val="24"/>
+        </w:rPr>
+        <w:t>operation</w:t>
+      </w:r>
+      <w:proofErr w:type="spellEnd"/>
+      <w:r>
+        <w:rPr>
+          <w:sz w:val="24"/>
+        </w:rPr>
+        <w:t xml:space="preserve">: </w:t>
+      </w:r>
+      <w:proofErr w:type="spellStart"/>
+      <w:r>
+        <w:rPr>
+          <w:sz w:val="24"/>
+        </w:rPr>
+        <w:t>logout</w:t>
+      </w:r>
+      <w:proofErr w:type="spellEnd"/>
+    </w:p>
+    <w:p>
+      <w:pPr>
+        <w:spacing w:after="0"/>
+        <w:rPr>
+          <w:sz w:val="24"/>
+        </w:rPr>
+      </w:pPr>
+      <w:proofErr w:type="spellStart"/>
+      <w:r>
+        <w:rPr>
+          <w:sz w:val="24"/>
+        </w:rPr>
+        <w:t>sessionkey</w:t>
+      </w:r>
+      <w:proofErr w:type="spellEnd"/>
+      <w:r>
+        <w:rPr>
+          <w:sz w:val="24"/>
+        </w:rPr>
+        <w:t>: 6420</w:t>
+      </w:r>
+    </w:p>
+    <w:p>
+      <w:pPr>
+        <w:rPr>
+          <w:sz w:val="24"/>
+        </w:rPr>
+      </w:pPr>
+    </w:p>
+    <w:p>
+      <w:pPr>
+        <w:rPr>
+          <w:sz w:val="24"/>
+        </w:rPr>
+      </w:pPr>
+      <w:r>
+        <w:rPr>
+          <w:sz w:val="24"/>
+        </w:rPr>
+        <w:t>DIRECTORIO: rechaza el cierre de sesión del Cliente</w:t>
+      </w:r>
+    </w:p>
+    <w:p>
+      <w:pPr>
+        <w:rPr>
+          <w:sz w:val="24"/>
+        </w:rPr>
+      </w:pPr>
+      <w:proofErr w:type="spellStart"/>
+      <w:r>
+        <w:rPr>
+          <w:sz w:val="24"/>
+        </w:rPr>
+        <w:t>operation</w:t>
+      </w:r>
+      <w:proofErr w:type="spellEnd"/>
+      <w:r>
+        <w:rPr>
+          <w:sz w:val="24"/>
+        </w:rPr>
+        <w:t xml:space="preserve">: </w:t>
+      </w:r>
+      <w:proofErr w:type="spellStart"/>
+      <w:r>
+        <w:rPr>
+          <w:sz w:val="24"/>
+        </w:rPr>
+        <w:t>logoutOk</w:t>
+      </w:r>
+      <w:proofErr w:type="spellEnd"/>
+    </w:p>
+    <w:p>
+      <w:pPr>
+        <w:rPr>
+          <w:sz w:val="24"/>
+        </w:rPr>
+      </w:pPr>
+    </w:p>
+    <w:p>
+      <w:pPr>
+        <w:rPr>
+          <w:sz w:val="24"/>
+        </w:rPr>
+      </w:pPr>
+      <w:r>
+        <w:rPr>
+          <w:sz w:val="24"/>
+        </w:rPr>
+        <w:lastRenderedPageBreak/>
+        <w:t>Directorio:</w:t>
       </w:r>
       <w:r>
         <w:rPr>
@@ -3829,442 +5195,11 @@
         </w:rPr>
         <w:t xml:space="preserve"> </w:t>
       </w:r>
-      <w:proofErr w:type="spellStart"/>
-      <w:r>
-        <w:rPr>
-          <w:sz w:val="24"/>
-        </w:rPr>
-        <w:t>loginOk</w:t>
-      </w:r>
-      <w:proofErr w:type="spellEnd"/>
-    </w:p>
-    <w:p>
-      <w:pPr>
-        <w:spacing w:after="0"/>
-        <w:rPr>
-          <w:sz w:val="24"/>
-        </w:rPr>
-      </w:pPr>
-      <w:proofErr w:type="spellStart"/>
-      <w:r>
-        <w:rPr>
-          <w:sz w:val="24"/>
-        </w:rPr>
-        <w:t>sessionkey</w:t>
-      </w:r>
-      <w:proofErr w:type="spellEnd"/>
-      <w:r>
-        <w:rPr>
-          <w:sz w:val="24"/>
-        </w:rPr>
-        <w:t>: 6420</w:t>
-      </w:r>
-    </w:p>
-    <w:p>
-      <w:pPr>
-        <w:rPr>
-          <w:sz w:val="24"/>
-        </w:rPr>
-      </w:pPr>
-    </w:p>
-    <w:p>
-      <w:pPr>
-        <w:rPr>
-          <w:sz w:val="24"/>
-        </w:rPr>
-      </w:pPr>
-      <w:r>
-        <w:rPr>
-          <w:sz w:val="24"/>
-        </w:rPr>
-        <w:t>CLIENTE: pide la lista de usuarios</w:t>
-      </w:r>
-    </w:p>
-    <w:p>
-      <w:pPr>
-        <w:spacing w:after="0"/>
-        <w:rPr>
-          <w:sz w:val="24"/>
-        </w:rPr>
-      </w:pPr>
-      <w:proofErr w:type="spellStart"/>
-      <w:r>
-        <w:rPr>
-          <w:sz w:val="24"/>
-        </w:rPr>
-        <w:t>operation</w:t>
-      </w:r>
-      <w:proofErr w:type="spellEnd"/>
-      <w:r>
-        <w:rPr>
-          <w:sz w:val="24"/>
-        </w:rPr>
-        <w:t xml:space="preserve">: </w:t>
-      </w:r>
-      <w:proofErr w:type="spellStart"/>
-      <w:r>
-        <w:rPr>
-          <w:sz w:val="24"/>
-        </w:rPr>
-        <w:t>userlist</w:t>
-      </w:r>
-      <w:proofErr w:type="spellEnd"/>
-    </w:p>
-    <w:p>
-      <w:pPr>
-        <w:spacing w:after="0"/>
-        <w:rPr>
-          <w:sz w:val="24"/>
-        </w:rPr>
-      </w:pPr>
-      <w:proofErr w:type="spellStart"/>
-      <w:r>
-        <w:rPr>
-          <w:sz w:val="24"/>
-        </w:rPr>
-        <w:t>sessionkey</w:t>
-      </w:r>
-      <w:proofErr w:type="spellEnd"/>
-      <w:r>
-        <w:rPr>
-          <w:sz w:val="24"/>
-        </w:rPr>
-        <w:t>: 6420</w:t>
-      </w:r>
-    </w:p>
-    <w:p>
-      <w:pPr>
-        <w:rPr>
-          <w:sz w:val="24"/>
-        </w:rPr>
-      </w:pPr>
-    </w:p>
-    <w:p>
-      <w:pPr>
-        <w:rPr>
-          <w:sz w:val="24"/>
-        </w:rPr>
-      </w:pPr>
-      <w:r>
-        <w:rPr>
-          <w:sz w:val="24"/>
-        </w:rPr>
-        <w:t>DIRECTORIO</w:t>
-      </w:r>
-      <w:r>
-        <w:rPr>
-          <w:sz w:val="24"/>
-        </w:rPr>
-        <w:t>: devuelve la lista de usuarios</w:t>
-      </w:r>
-    </w:p>
-    <w:p>
-      <w:pPr>
-        <w:spacing w:after="0"/>
-        <w:rPr>
-          <w:sz w:val="24"/>
-        </w:rPr>
-      </w:pPr>
-      <w:proofErr w:type="spellStart"/>
-      <w:r>
-        <w:rPr>
-          <w:sz w:val="24"/>
-        </w:rPr>
-        <w:t>operation</w:t>
-      </w:r>
-      <w:proofErr w:type="spellEnd"/>
-      <w:r>
-        <w:rPr>
-          <w:sz w:val="24"/>
-        </w:rPr>
-        <w:t xml:space="preserve">: </w:t>
-      </w:r>
-      <w:proofErr w:type="spellStart"/>
-      <w:r>
-        <w:rPr>
-          <w:sz w:val="24"/>
-        </w:rPr>
-        <w:t>userlistOk</w:t>
-      </w:r>
-      <w:proofErr w:type="spellEnd"/>
-    </w:p>
-    <w:p>
-      <w:pPr>
-        <w:spacing w:after="0"/>
-        <w:rPr>
-          <w:sz w:val="24"/>
-        </w:rPr>
-      </w:pPr>
-      <w:proofErr w:type="spellStart"/>
-      <w:r>
-        <w:rPr>
-          <w:sz w:val="24"/>
-        </w:rPr>
-        <w:t>users</w:t>
-      </w:r>
-      <w:proofErr w:type="spellEnd"/>
-      <w:r>
-        <w:rPr>
-          <w:sz w:val="24"/>
-        </w:rPr>
-        <w:t>: Dio</w:t>
-      </w:r>
-    </w:p>
-    <w:p>
-      <w:pPr>
-        <w:rPr>
-          <w:sz w:val="24"/>
-        </w:rPr>
-      </w:pPr>
-    </w:p>
-    <w:p>
-      <w:pPr>
-        <w:rPr>
-          <w:sz w:val="24"/>
-        </w:rPr>
-      </w:pPr>
-      <w:r>
-        <w:rPr>
-          <w:sz w:val="24"/>
-        </w:rPr>
-        <w:t>DIRECTORIO</w:t>
-      </w:r>
-      <w:r>
-        <w:rPr>
-          <w:sz w:val="24"/>
-        </w:rPr>
-        <w:t xml:space="preserve">: rechaza la </w:t>
-      </w:r>
-      <w:proofErr w:type="gramStart"/>
-      <w:r>
-        <w:rPr>
-          <w:sz w:val="24"/>
-        </w:rPr>
-        <w:t>operación(</w:t>
-      </w:r>
-      <w:proofErr w:type="spellStart"/>
-      <w:proofErr w:type="gramEnd"/>
-      <w:r>
-        <w:rPr>
-          <w:sz w:val="24"/>
-        </w:rPr>
-        <w:t>nunta</w:t>
-      </w:r>
-      <w:proofErr w:type="spellEnd"/>
-      <w:r>
-        <w:rPr>
-          <w:sz w:val="24"/>
-        </w:rPr>
-        <w:t xml:space="preserve"> debería pasar ya que para hacer </w:t>
-      </w:r>
-      <w:proofErr w:type="spellStart"/>
-      <w:r>
-        <w:rPr>
-          <w:sz w:val="24"/>
-        </w:rPr>
-        <w:t>userlist</w:t>
-      </w:r>
-      <w:proofErr w:type="spellEnd"/>
-      <w:r>
-        <w:rPr>
-          <w:sz w:val="24"/>
-        </w:rPr>
-        <w:t xml:space="preserve"> tiene que estar registrado el usuario y por tanto siempre va a haber como minimo 1 usuario registrado a la hora de procesar el </w:t>
-      </w:r>
-      <w:proofErr w:type="spellStart"/>
-      <w:r>
-        <w:rPr>
-          <w:sz w:val="24"/>
-        </w:rPr>
-        <w:t>userlist</w:t>
-      </w:r>
-      <w:proofErr w:type="spellEnd"/>
-      <w:r>
-        <w:rPr>
-          <w:sz w:val="24"/>
-        </w:rPr>
-        <w:t>)</w:t>
-      </w:r>
-    </w:p>
-    <w:p>
-      <w:pPr>
-        <w:rPr>
-          <w:sz w:val="24"/>
-        </w:rPr>
-      </w:pPr>
-      <w:proofErr w:type="spellStart"/>
-      <w:r>
-        <w:rPr>
-          <w:sz w:val="24"/>
-        </w:rPr>
-        <w:t>operation</w:t>
-      </w:r>
-      <w:proofErr w:type="spellEnd"/>
-      <w:r>
-        <w:rPr>
-          <w:sz w:val="24"/>
-        </w:rPr>
-        <w:t xml:space="preserve">: </w:t>
-      </w:r>
-      <w:proofErr w:type="spellStart"/>
-      <w:r>
-        <w:rPr>
-          <w:sz w:val="24"/>
-        </w:rPr>
-        <w:t>userlistFail</w:t>
-      </w:r>
-      <w:proofErr w:type="spellEnd"/>
-    </w:p>
-    <w:p>
-      <w:pPr>
-        <w:rPr>
-          <w:sz w:val="24"/>
-        </w:rPr>
-      </w:pPr>
-    </w:p>
-    <w:p>
-      <w:pPr>
-        <w:rPr>
-          <w:sz w:val="24"/>
-        </w:rPr>
-      </w:pPr>
-      <w:r>
-        <w:rPr>
-          <w:sz w:val="24"/>
-        </w:rPr>
-        <w:t>CLIENTE: solicita cerrar su sesión en el Directorio</w:t>
-      </w:r>
-    </w:p>
-    <w:p>
-      <w:pPr>
-        <w:spacing w:after="0"/>
-        <w:rPr>
-          <w:sz w:val="24"/>
-        </w:rPr>
-      </w:pPr>
-      <w:proofErr w:type="spellStart"/>
-      <w:r>
-        <w:rPr>
-          <w:sz w:val="24"/>
-        </w:rPr>
-        <w:t>operation</w:t>
-      </w:r>
-      <w:proofErr w:type="spellEnd"/>
-      <w:r>
-        <w:rPr>
-          <w:sz w:val="24"/>
-        </w:rPr>
-        <w:t xml:space="preserve">: </w:t>
-      </w:r>
-      <w:proofErr w:type="spellStart"/>
-      <w:r>
-        <w:rPr>
-          <w:sz w:val="24"/>
-        </w:rPr>
-        <w:t>logout</w:t>
-      </w:r>
-      <w:proofErr w:type="spellEnd"/>
-    </w:p>
-    <w:p>
-      <w:pPr>
-        <w:spacing w:after="0"/>
-        <w:rPr>
-          <w:sz w:val="24"/>
-        </w:rPr>
-      </w:pPr>
-      <w:proofErr w:type="spellStart"/>
-      <w:r>
-        <w:rPr>
-          <w:sz w:val="24"/>
-        </w:rPr>
-        <w:t>sessionkey</w:t>
-      </w:r>
-      <w:proofErr w:type="spellEnd"/>
-      <w:r>
-        <w:rPr>
-          <w:sz w:val="24"/>
-        </w:rPr>
-        <w:t>: 6420</w:t>
-      </w:r>
-    </w:p>
-    <w:p>
-      <w:pPr>
-        <w:rPr>
-          <w:sz w:val="24"/>
-        </w:rPr>
-      </w:pPr>
-    </w:p>
-    <w:p>
-      <w:pPr>
-        <w:rPr>
-          <w:sz w:val="24"/>
-        </w:rPr>
-      </w:pPr>
-      <w:r>
-        <w:rPr>
-          <w:sz w:val="24"/>
-        </w:rPr>
-        <w:t>DIRECTORIO: rechaza el cierre de sesión del Cliente</w:t>
-      </w:r>
-    </w:p>
-    <w:p>
-      <w:pPr>
-        <w:rPr>
-          <w:sz w:val="24"/>
-        </w:rPr>
-      </w:pPr>
-      <w:proofErr w:type="spellStart"/>
-      <w:r>
-        <w:rPr>
-          <w:sz w:val="24"/>
-        </w:rPr>
-        <w:t>operation</w:t>
-      </w:r>
-      <w:proofErr w:type="spellEnd"/>
-      <w:r>
-        <w:rPr>
-          <w:sz w:val="24"/>
-        </w:rPr>
-        <w:t xml:space="preserve">: </w:t>
-      </w:r>
-      <w:proofErr w:type="spellStart"/>
-      <w:r>
-        <w:rPr>
-          <w:sz w:val="24"/>
-        </w:rPr>
-        <w:t>logoutOk</w:t>
-      </w:r>
-      <w:proofErr w:type="spellEnd"/>
-    </w:p>
-    <w:p>
-      <w:pPr>
-        <w:rPr>
-          <w:sz w:val="24"/>
-        </w:rPr>
-      </w:pPr>
-    </w:p>
-    <w:p>
-      <w:pPr>
-        <w:rPr>
-          <w:sz w:val="24"/>
-        </w:rPr>
-      </w:pPr>
-      <w:proofErr w:type="spellStart"/>
-      <w:proofErr w:type="gramStart"/>
-      <w:r>
-        <w:rPr>
-          <w:sz w:val="24"/>
-        </w:rPr>
-        <w:lastRenderedPageBreak/>
-        <w:t>Directorio:acepta</w:t>
-      </w:r>
-      <w:proofErr w:type="spellEnd"/>
-      <w:proofErr w:type="gramEnd"/>
-      <w:r>
-        <w:rPr>
-          <w:sz w:val="24"/>
-        </w:rPr>
-        <w:t xml:space="preserve"> el cierre de sesión del Cliente en el Directorio</w:t>
+      <w:r>
+        <w:rPr>
+          <w:sz w:val="24"/>
+        </w:rPr>
+        <w:t>acepta el cierre de sesión del Cliente en el Directorio</w:t>
       </w:r>
     </w:p>
     <w:p>
@@ -4549,7 +5484,7 @@
           <w:rPr>
             <w:noProof/>
           </w:rPr>
-          <w:t>9</w:t>
+          <w:t>13</w:t>
         </w:r>
         <w:r>
           <w:fldChar w:fldCharType="end"/>
@@ -6114,6 +7049,7 @@
   <w:style w:type="character" w:default="1" w:styleId="Fuentedeprrafopredeter">
     <w:name w:val="Default Paragraph Font"/>
     <w:uiPriority w:val="1"/>
+    <w:semiHidden/>
     <w:unhideWhenUsed/>
   </w:style>
   <w:style w:type="table" w:default="1" w:styleId="Tablanormal">
@@ -6479,7 +7415,7 @@
 </file>
 
 <file path=customXml/itemProps1.xml><?xml version="1.0" encoding="utf-8"?>
-<ds:datastoreItem xmlns:ds="http://schemas.openxmlformats.org/officeDocument/2006/customXml" ds:itemID="{D02F80B6-3D2E-4F20-A9A4-D2BEFE12E57B}">
+<ds:datastoreItem xmlns:ds="http://schemas.openxmlformats.org/officeDocument/2006/customXml" ds:itemID="{A26E9E5B-9985-4E1B-AF3C-3952B75D5AB6}">
   <ds:schemaRefs>
     <ds:schemaRef ds:uri="http://schemas.openxmlformats.org/officeDocument/2006/bibliography"/>
   </ds:schemaRefs>

</xml_diff>